<commit_message>
docs: add deployment scripts and env var tables
</commit_message>
<xml_diff>
--- a/ENTREGA_Comured.docx
+++ b/ENTREGA_Comured.docx
@@ -955,7 +955,7 @@
         <w:pStyle w:val="ListBullet"/>
       </w:pPr>
       <w:r>
-        <w:t>Frontend: con NEXT_PUBLIC_API_URL=&lt;URL pública de la API&gt; en web/.env, ejecutar npm run build en web/ y subir el contenido de web/out/ al document root del subdominio.</w:t>
+        <w:t>Frontend: con NEXT_PUBLIC_API_URL=&lt;URL pública de la API&gt; en web/.env, ejecutar `npm run upload -- web` (compila web/ y sube `web/out/`).</w:t>
       </w:r>
     </w:p>
     <w:p>
@@ -979,7 +979,15 @@
         <w:pStyle w:val="ListBullet"/>
       </w:pPr>
       <w:r>
-        <w:t>Panel admin: npm run build en admin-react/ y servir el dist como sitio estático (o integrar en el mismo dominio).</w:t>
+        <w:t>Panel admin: ejecutar `npm run upload -- admin` (compila admin-react/ y sube api/public/admin/dist/) para servirlo en su subdominio.</w:t>
+      </w:r>
+    </w:p>
+    <w:p>
+      <w:pPr>
+        <w:pStyle w:val="ListBullet"/>
+      </w:pPr>
+      <w:r>
+        <w:t>Verificar archivos en el servidor con `npm run ssh -- "ls domains/appsennovaguajira.com/public_html/comured"`.</w:t>
       </w:r>
     </w:p>
     <w:p>

</xml_diff>